<commit_message>
Update vision figure and blog social media assets
Made-with: Cursor
</commit_message>
<xml_diff>
--- a/blog/social_media_tight.docx
+++ b/blog/social_media_tight.docx
@@ -69,6 +69,30 @@
           <w:szCs w:val="22"/>
         </w:rPr>
         <w:t xml:space="preserve"> the discovery, diagnosis, and care of neurodegenerative diseases. </w:t>
+      </w:r>
+      <w:r>
+        <w:rPr>
+          <w:rFonts w:ascii="CMU Serif Roman" w:hAnsi="CMU Serif Roman" w:cs="CMU Serif Roman"/>
+          <w:sz w:val="22"/>
+          <w:szCs w:val="22"/>
+        </w:rPr>
+        <w:t xml:space="preserve">Visit our website to learn more: </w:t>
+      </w:r>
+      <w:r>
+        <w:rPr>
+          <w:rFonts w:ascii="CMU Serif Roman" w:hAnsi="CMU Serif Roman" w:cs="CMU Serif Roman"/>
+          <w:sz w:val="22"/>
+          <w:szCs w:val="22"/>
+        </w:rPr>
+        <w:t>https://neuroailab.ucsf.edu/</w:t>
+      </w:r>
+      <w:r>
+        <w:rPr>
+          <w:rFonts w:ascii="CMU Serif Roman" w:hAnsi="CMU Serif Roman" w:cs="CMU Serif Roman"/>
+          <w:sz w:val="22"/>
+          <w:szCs w:val="22"/>
+        </w:rPr>
+        <w:t xml:space="preserve">. </w:t>
       </w:r>
     </w:p>
     <w:p>
@@ -815,7 +839,23 @@
           <w:sz w:val="22"/>
           <w:szCs w:val="22"/>
         </w:rPr>
-        <w:t>We have been working hard this year. Here are a few</w:t>
+        <w:t>We have been working hard</w:t>
+      </w:r>
+      <w:r>
+        <w:rPr>
+          <w:rFonts w:ascii="CMU Serif Roman" w:hAnsi="CMU Serif Roman" w:cs="CMU Serif Roman"/>
+          <w:sz w:val="22"/>
+          <w:szCs w:val="22"/>
+        </w:rPr>
+        <w:t>!</w:t>
+      </w:r>
+      <w:r>
+        <w:rPr>
+          <w:rFonts w:ascii="CMU Serif Roman" w:hAnsi="CMU Serif Roman" w:cs="CMU Serif Roman"/>
+          <w:sz w:val="22"/>
+          <w:szCs w:val="22"/>
+        </w:rPr>
+        <w:t xml:space="preserve"> Here are a few</w:t>
       </w:r>
       <w:r>
         <w:rPr>
@@ -831,7 +871,23 @@
           <w:sz w:val="22"/>
           <w:szCs w:val="22"/>
         </w:rPr>
-        <w:t xml:space="preserve"> highlights: </w:t>
+        <w:t xml:space="preserve"> highlights</w:t>
+      </w:r>
+      <w:r>
+        <w:rPr>
+          <w:rFonts w:ascii="CMU Serif Roman" w:hAnsi="CMU Serif Roman" w:cs="CMU Serif Roman"/>
+          <w:sz w:val="22"/>
+          <w:szCs w:val="22"/>
+        </w:rPr>
+        <w:t xml:space="preserve"> of this year</w:t>
+      </w:r>
+      <w:r>
+        <w:rPr>
+          <w:rFonts w:ascii="CMU Serif Roman" w:hAnsi="CMU Serif Roman" w:cs="CMU Serif Roman"/>
+          <w:sz w:val="22"/>
+          <w:szCs w:val="22"/>
+        </w:rPr>
+        <w:t xml:space="preserve">: </w:t>
       </w:r>
     </w:p>
     <w:p>
@@ -1165,6 +1221,14 @@
         </w:rPr>
         <w:t>We have several open positions for clinical research coordinators, data scientists, and postdocs. Reach out if you are interested in joining our team!</w:t>
       </w:r>
+      <w:r>
+        <w:rPr>
+          <w:rFonts w:ascii="CMU Serif Roman" w:hAnsi="CMU Serif Roman" w:cs="CMU Serif Roman"/>
+          <w:sz w:val="22"/>
+          <w:szCs w:val="22"/>
+        </w:rPr>
+        <w:t xml:space="preserve"> </w:t>
+      </w:r>
     </w:p>
     <w:p>
       <w:pPr>
@@ -1276,7 +1340,7 @@
     </w:p>
     <w:sectPr>
       <w:pgSz w:w="12240" w:h="15840"/>
-      <w:pgMar w:top="1440" w:right="1440" w:bottom="1440" w:left="1440" w:header="720" w:footer="720" w:gutter="0"/>
+      <w:pgMar w:top="720" w:right="720" w:bottom="720" w:left="720" w:header="720" w:footer="720" w:gutter="0"/>
       <w:cols w:space="720"/>
       <w:docGrid w:linePitch="360"/>
     </w:sectPr>

</xml_diff>